<commit_message>
:bento: adding planning documents to project
</commit_message>
<xml_diff>
--- a/public/planejamentoQSN.docx
+++ b/public/planejamentoQSN.docx
@@ -134,48 +134,367 @@
                 <w:shd w:fill="auto" w:val="clear"/>
                 <w:vertAlign w:val="baseline"/>
               </w:rPr>
-              <w:t>EPG MAURO ROLDÃO NETO</w:t>
+              <w:t>N</w:t>
+            </w:r>
+            <w:r>
+              <w:rPr>
+                <w:rFonts w:eastAsia="Arial" w:cs="Arial" w:ascii="Arial" w:hAnsi="Arial"/>
+                <w:b/>
+                <w:i w:val="false"/>
+                <w:caps w:val="false"/>
+                <w:smallCaps w:val="false"/>
+                <w:strike w:val="false"/>
+                <w:dstrike w:val="false"/>
+                <w:color w:val="000000"/>
+                <w:position w:val="0"/>
+                <w:sz w:val="24"/>
+                <w:sz w:val="24"/>
+                <w:szCs w:val="24"/>
+                <w:u w:val="none"/>
+                <w:shd w:fill="auto" w:val="clear"/>
+                <w:vertAlign w:val="baseline"/>
+              </w:rPr>
+              <w:t>o</w:t>
+            </w:r>
+            <w:r>
+              <w:rPr>
+                <w:rFonts w:eastAsia="Arial" w:cs="Arial" w:ascii="Arial" w:hAnsi="Arial"/>
+                <w:b/>
+                <w:i w:val="false"/>
+                <w:caps w:val="false"/>
+                <w:smallCaps w:val="false"/>
+                <w:strike w:val="false"/>
+                <w:dstrike w:val="false"/>
+                <w:color w:val="000000"/>
+                <w:position w:val="0"/>
+                <w:sz w:val="24"/>
+                <w:sz w:val="24"/>
+                <w:szCs w:val="24"/>
+                <w:u w:val="none"/>
+                <w:shd w:fill="auto" w:val="clear"/>
+                <w:vertAlign w:val="baseline"/>
+              </w:rPr>
+              <w:t>m</w:t>
+            </w:r>
+            <w:r>
+              <w:rPr>
+                <w:rFonts w:eastAsia="Arial" w:cs="Arial" w:ascii="Arial" w:hAnsi="Arial"/>
+                <w:b/>
+                <w:i w:val="false"/>
+                <w:caps w:val="false"/>
+                <w:smallCaps w:val="false"/>
+                <w:strike w:val="false"/>
+                <w:dstrike w:val="false"/>
+                <w:color w:val="000000"/>
+                <w:position w:val="0"/>
+                <w:sz w:val="24"/>
+                <w:sz w:val="24"/>
+                <w:szCs w:val="24"/>
+                <w:u w:val="none"/>
+                <w:shd w:fill="auto" w:val="clear"/>
+                <w:vertAlign w:val="baseline"/>
+              </w:rPr>
+              <w:t xml:space="preserve">e </w:t>
+            </w:r>
+            <w:r>
+              <w:rPr>
+                <w:rFonts w:eastAsia="Arial" w:cs="Arial" w:ascii="Arial" w:hAnsi="Arial"/>
+                <w:b/>
+                <w:i w:val="false"/>
+                <w:caps w:val="false"/>
+                <w:smallCaps w:val="false"/>
+                <w:strike w:val="false"/>
+                <w:dstrike w:val="false"/>
+                <w:color w:val="000000"/>
+                <w:position w:val="0"/>
+                <w:sz w:val="24"/>
+                <w:sz w:val="24"/>
+                <w:szCs w:val="24"/>
+                <w:u w:val="none"/>
+                <w:shd w:fill="auto" w:val="clear"/>
+                <w:vertAlign w:val="baseline"/>
+              </w:rPr>
+              <w:t>d</w:t>
+            </w:r>
+            <w:r>
+              <w:rPr>
+                <w:rFonts w:eastAsia="Arial" w:cs="Arial" w:ascii="Arial" w:hAnsi="Arial"/>
+                <w:b/>
+                <w:i w:val="false"/>
+                <w:caps w:val="false"/>
+                <w:smallCaps w:val="false"/>
+                <w:strike w:val="false"/>
+                <w:dstrike w:val="false"/>
+                <w:color w:val="000000"/>
+                <w:position w:val="0"/>
+                <w:sz w:val="24"/>
+                <w:sz w:val="24"/>
+                <w:szCs w:val="24"/>
+                <w:u w:val="none"/>
+                <w:shd w:fill="auto" w:val="clear"/>
+                <w:vertAlign w:val="baseline"/>
+              </w:rPr>
+              <w:t xml:space="preserve">a </w:t>
+            </w:r>
+            <w:r>
+              <w:rPr>
+                <w:rFonts w:eastAsia="Arial" w:cs="Arial" w:ascii="Arial" w:hAnsi="Arial"/>
+                <w:b/>
+                <w:i w:val="false"/>
+                <w:caps w:val="false"/>
+                <w:smallCaps w:val="false"/>
+                <w:strike w:val="false"/>
+                <w:dstrike w:val="false"/>
+                <w:color w:val="000000"/>
+                <w:position w:val="0"/>
+                <w:sz w:val="24"/>
+                <w:sz w:val="24"/>
+                <w:szCs w:val="24"/>
+                <w:u w:val="none"/>
+                <w:shd w:fill="auto" w:val="clear"/>
+                <w:vertAlign w:val="baseline"/>
+              </w:rPr>
+              <w:t>e</w:t>
+            </w:r>
+            <w:r>
+              <w:rPr>
+                <w:rFonts w:eastAsia="Arial" w:cs="Arial" w:ascii="Arial" w:hAnsi="Arial"/>
+                <w:b/>
+                <w:i w:val="false"/>
+                <w:caps w:val="false"/>
+                <w:smallCaps w:val="false"/>
+                <w:strike w:val="false"/>
+                <w:dstrike w:val="false"/>
+                <w:color w:val="000000"/>
+                <w:position w:val="0"/>
+                <w:sz w:val="24"/>
+                <w:sz w:val="24"/>
+                <w:szCs w:val="24"/>
+                <w:u w:val="none"/>
+                <w:shd w:fill="auto" w:val="clear"/>
+                <w:vertAlign w:val="baseline"/>
+              </w:rPr>
+              <w:t>s</w:t>
+            </w:r>
+            <w:r>
+              <w:rPr>
+                <w:rFonts w:eastAsia="Arial" w:cs="Arial" w:ascii="Arial" w:hAnsi="Arial"/>
+                <w:b/>
+                <w:i w:val="false"/>
+                <w:caps w:val="false"/>
+                <w:smallCaps w:val="false"/>
+                <w:strike w:val="false"/>
+                <w:dstrike w:val="false"/>
+                <w:color w:val="000000"/>
+                <w:position w:val="0"/>
+                <w:sz w:val="24"/>
+                <w:sz w:val="24"/>
+                <w:szCs w:val="24"/>
+                <w:u w:val="none"/>
+                <w:shd w:fill="auto" w:val="clear"/>
+                <w:vertAlign w:val="baseline"/>
+              </w:rPr>
+              <w:t>c</w:t>
+            </w:r>
+            <w:r>
+              <w:rPr>
+                <w:rFonts w:eastAsia="Arial" w:cs="Arial" w:ascii="Arial" w:hAnsi="Arial"/>
+                <w:b/>
+                <w:i w:val="false"/>
+                <w:caps w:val="false"/>
+                <w:smallCaps w:val="false"/>
+                <w:strike w:val="false"/>
+                <w:dstrike w:val="false"/>
+                <w:color w:val="000000"/>
+                <w:position w:val="0"/>
+                <w:sz w:val="24"/>
+                <w:sz w:val="24"/>
+                <w:szCs w:val="24"/>
+                <w:u w:val="none"/>
+                <w:shd w:fill="auto" w:val="clear"/>
+                <w:vertAlign w:val="baseline"/>
+              </w:rPr>
+              <w:t>o</w:t>
+            </w:r>
+            <w:r>
+              <w:rPr>
+                <w:rFonts w:eastAsia="Arial" w:cs="Arial" w:ascii="Arial" w:hAnsi="Arial"/>
+                <w:b/>
+                <w:i w:val="false"/>
+                <w:caps w:val="false"/>
+                <w:smallCaps w:val="false"/>
+                <w:strike w:val="false"/>
+                <w:dstrike w:val="false"/>
+                <w:color w:val="000000"/>
+                <w:position w:val="0"/>
+                <w:sz w:val="24"/>
+                <w:sz w:val="24"/>
+                <w:szCs w:val="24"/>
+                <w:u w:val="none"/>
+                <w:shd w:fill="auto" w:val="clear"/>
+                <w:vertAlign w:val="baseline"/>
+              </w:rPr>
+              <w:t>l</w:t>
+            </w:r>
+            <w:r>
+              <w:rPr>
+                <w:rFonts w:eastAsia="Arial" w:cs="Arial" w:ascii="Arial" w:hAnsi="Arial"/>
+                <w:b/>
+                <w:i w:val="false"/>
+                <w:caps w:val="false"/>
+                <w:smallCaps w:val="false"/>
+                <w:strike w:val="false"/>
+                <w:dstrike w:val="false"/>
+                <w:color w:val="000000"/>
+                <w:position w:val="0"/>
+                <w:sz w:val="24"/>
+                <w:sz w:val="24"/>
+                <w:szCs w:val="24"/>
+                <w:u w:val="none"/>
+                <w:shd w:fill="auto" w:val="clear"/>
+                <w:vertAlign w:val="baseline"/>
+              </w:rPr>
+              <w:t>a</w:t>
+            </w:r>
+            <w:r>
+              <w:rPr>
+                <w:rFonts w:eastAsia="Arial" w:cs="Arial" w:ascii="Arial" w:hAnsi="Arial"/>
+                <w:b/>
+                <w:i w:val="false"/>
+                <w:caps w:val="false"/>
+                <w:smallCaps w:val="false"/>
+                <w:strike w:val="false"/>
+                <w:dstrike w:val="false"/>
+                <w:color w:val="000000"/>
+                <w:position w:val="0"/>
+                <w:sz w:val="24"/>
+                <w:sz w:val="24"/>
+                <w:szCs w:val="24"/>
+                <w:u w:val="none"/>
+                <w:shd w:fill="auto" w:val="clear"/>
+                <w:vertAlign w:val="baseline"/>
+              </w:rPr>
               <w:tab/>
             </w:r>
             <w:r>
               <w:rPr>
                 <w:rFonts w:eastAsia="Arial" w:cs="Arial" w:ascii="Arial" w:hAnsi="Arial"/>
                 <w:b/>
-                <w:color w:val="000000"/>
-                <w:sz w:val="24"/>
-                <w:szCs w:val="24"/>
-              </w:rPr>
-              <w:t xml:space="preserve">E1F </w:t>
-            </w:r>
-            <w:r>
-              <w:rPr>
-                <w:rFonts w:eastAsia="Arial" w:cs="Arial" w:ascii="Arial" w:hAnsi="Arial"/>
-                <w:b/>
-                <w:i w:val="false"/>
-                <w:caps w:val="false"/>
-                <w:smallCaps w:val="false"/>
-                <w:strike w:val="false"/>
-                <w:dstrike w:val="false"/>
-                <w:color w:val="000000"/>
-                <w:position w:val="0"/>
-                <w:sz w:val="24"/>
-                <w:sz w:val="24"/>
-                <w:szCs w:val="24"/>
-                <w:u w:val="none"/>
-                <w:shd w:fill="auto" w:val="clear"/>
-                <w:vertAlign w:val="baseline"/>
-              </w:rPr>
-              <w:t xml:space="preserve">- SALA </w:t>
-            </w:r>
-            <w:r>
-              <w:rPr>
-                <w:rFonts w:eastAsia="Arial" w:cs="Arial" w:ascii="Arial" w:hAnsi="Arial"/>
-                <w:b/>
-                <w:color w:val="000000"/>
-                <w:sz w:val="24"/>
-                <w:szCs w:val="24"/>
-              </w:rPr>
-              <w:t>12</w:t>
+                <w:i w:val="false"/>
+                <w:caps w:val="false"/>
+                <w:smallCaps w:val="false"/>
+                <w:strike w:val="false"/>
+                <w:dstrike w:val="false"/>
+                <w:color w:val="000000"/>
+                <w:position w:val="0"/>
+                <w:sz w:val="24"/>
+                <w:sz w:val="24"/>
+                <w:szCs w:val="24"/>
+                <w:u w:val="none"/>
+                <w:shd w:fill="auto" w:val="clear"/>
+                <w:vertAlign w:val="baseline"/>
+              </w:rPr>
+              <w:t>{</w:t>
+            </w:r>
+            <w:r>
+              <w:rPr>
+                <w:rFonts w:eastAsia="Arial" w:cs="Arial" w:ascii="Arial" w:hAnsi="Arial"/>
+                <w:b/>
+                <w:i w:val="false"/>
+                <w:caps w:val="false"/>
+                <w:smallCaps w:val="false"/>
+                <w:strike w:val="false"/>
+                <w:dstrike w:val="false"/>
+                <w:color w:val="000000"/>
+                <w:position w:val="0"/>
+                <w:sz w:val="24"/>
+                <w:sz w:val="24"/>
+                <w:szCs w:val="24"/>
+                <w:u w:val="none"/>
+                <w:shd w:fill="auto" w:val="clear"/>
+                <w:vertAlign w:val="baseline"/>
+              </w:rPr>
+              <w:t>s</w:t>
+            </w:r>
+            <w:r>
+              <w:rPr>
+                <w:rFonts w:eastAsia="Arial" w:cs="Arial" w:ascii="Arial" w:hAnsi="Arial"/>
+                <w:b/>
+                <w:i w:val="false"/>
+                <w:caps w:val="false"/>
+                <w:smallCaps w:val="false"/>
+                <w:strike w:val="false"/>
+                <w:dstrike w:val="false"/>
+                <w:color w:val="000000"/>
+                <w:position w:val="0"/>
+                <w:sz w:val="24"/>
+                <w:sz w:val="24"/>
+                <w:szCs w:val="24"/>
+                <w:u w:val="none"/>
+                <w:shd w:fill="auto" w:val="clear"/>
+                <w:vertAlign w:val="baseline"/>
+              </w:rPr>
+              <w:t>a</w:t>
+            </w:r>
+            <w:r>
+              <w:rPr>
+                <w:rFonts w:eastAsia="Arial" w:cs="Arial" w:ascii="Arial" w:hAnsi="Arial"/>
+                <w:b/>
+                <w:i w:val="false"/>
+                <w:caps w:val="false"/>
+                <w:smallCaps w:val="false"/>
+                <w:strike w:val="false"/>
+                <w:dstrike w:val="false"/>
+                <w:color w:val="000000"/>
+                <w:position w:val="0"/>
+                <w:sz w:val="24"/>
+                <w:sz w:val="24"/>
+                <w:szCs w:val="24"/>
+                <w:u w:val="none"/>
+                <w:shd w:fill="auto" w:val="clear"/>
+                <w:vertAlign w:val="baseline"/>
+              </w:rPr>
+              <w:t>l</w:t>
+            </w:r>
+            <w:r>
+              <w:rPr>
+                <w:rFonts w:eastAsia="Arial" w:cs="Arial" w:ascii="Arial" w:hAnsi="Arial"/>
+                <w:b/>
+                <w:i w:val="false"/>
+                <w:caps w:val="false"/>
+                <w:smallCaps w:val="false"/>
+                <w:strike w:val="false"/>
+                <w:dstrike w:val="false"/>
+                <w:color w:val="000000"/>
+                <w:position w:val="0"/>
+                <w:sz w:val="24"/>
+                <w:sz w:val="24"/>
+                <w:szCs w:val="24"/>
+                <w:u w:val="none"/>
+                <w:shd w:fill="auto" w:val="clear"/>
+                <w:vertAlign w:val="baseline"/>
+              </w:rPr>
+              <w:t>a</w:t>
+            </w:r>
+            <w:r>
+              <w:rPr>
+                <w:rFonts w:eastAsia="Arial" w:cs="Arial" w:ascii="Arial" w:hAnsi="Arial"/>
+                <w:b/>
+                <w:i w:val="false"/>
+                <w:caps w:val="false"/>
+                <w:smallCaps w:val="false"/>
+                <w:strike w:val="false"/>
+                <w:dstrike w:val="false"/>
+                <w:color w:val="000000"/>
+                <w:position w:val="0"/>
+                <w:sz w:val="24"/>
+                <w:sz w:val="24"/>
+                <w:szCs w:val="24"/>
+                <w:u w:val="none"/>
+                <w:shd w:fill="auto" w:val="clear"/>
+                <w:vertAlign w:val="baseline"/>
+              </w:rPr>
+              <w:t>}</w:t>
             </w:r>
             <w:r>
               <w:rPr>
@@ -1090,18 +1409,7 @@
                 <w:sz w:val="24"/>
                 <w:szCs w:val="24"/>
               </w:rPr>
-              <w:t>{saber1</w:t>
-            </w:r>
-            <w:r>
-              <w:rPr>
-                <w:rFonts w:eastAsia="Arial" w:cs="Arial" w:ascii="Arial" w:hAnsi="Arial"/>
-                <w:b w:val="false"/>
-                <w:bCs w:val="false"/>
-                <w:color w:val="000000"/>
-                <w:sz w:val="24"/>
-                <w:szCs w:val="24"/>
-              </w:rPr>
-              <w:t>}</w:t>
+              <w:t>{saber1}</w:t>
             </w:r>
           </w:p>
         </w:tc>
@@ -10070,7 +10378,12 @@
               </w:rPr>
             </w:pPr>
             <w:r>
-              <w:rPr/>
+              <w:rPr>
+                <w:rFonts w:ascii="Arial" w:hAnsi="Arial"/>
+                <w:color w:val="000000"/>
+                <w:sz w:val="24"/>
+                <w:szCs w:val="24"/>
+              </w:rPr>
             </w:r>
           </w:p>
           <w:p>
@@ -10119,7 +10432,12 @@
               </w:rPr>
             </w:pPr>
             <w:r>
-              <w:rPr/>
+              <w:rPr>
+                <w:rFonts w:ascii="Arial" w:hAnsi="Arial"/>
+                <w:color w:val="000000"/>
+                <w:sz w:val="24"/>
+                <w:szCs w:val="24"/>
+              </w:rPr>
             </w:r>
           </w:p>
         </w:tc>

</xml_diff>